<commit_message>
Adjunto la segunda parte y su documentacion respectivagit status!
</commit_message>
<xml_diff>
--- a/PC3.docx
+++ b/PC3.docx
@@ -818,14 +818,15 @@
           <w:rFonts w:ascii="Arial Black" w:hAnsi="Arial Black"/>
           <w:b/>
           <w:bCs/>
+          <w:noProof/>
           <w:sz w:val="36"/>
           <w:szCs w:val="36"/>
           <w:lang w:val="es-MX"/>
         </w:rPr>
         <w:drawing>
-          <wp:inline distT="0" distB="0" distL="0" distR="0" wp14:anchorId="5865AFC5" wp14:editId="3D44F2FB">
+          <wp:inline distT="0" distB="0" distL="0" distR="0" wp14:anchorId="5865AFC5" wp14:editId="00132EEA">
             <wp:extent cx="4953000" cy="3600143"/>
-            <wp:effectExtent l="0" t="0" r="0" b="635"/>
+            <wp:effectExtent l="0" t="0" r="0" b="8890"/>
             <wp:docPr id="1760515904" name="Imagen 1"/>
             <wp:cNvGraphicFramePr>
               <a:graphicFrameLocks xmlns:a="http://schemas.openxmlformats.org/drawingml/2006/main" noChangeAspect="1"/>
@@ -846,7 +847,7 @@
                   <pic:spPr>
                     <a:xfrm>
                       <a:off x="0" y="0"/>
-                      <a:ext cx="4970980" cy="3613212"/>
+                      <a:ext cx="4953000" cy="3600143"/>
                     </a:xfrm>
                     <a:prstGeom prst="rect">
                       <a:avLst/>
@@ -910,6 +911,7 @@
           <w:rFonts w:ascii="Arial Black" w:hAnsi="Arial Black"/>
           <w:b/>
           <w:bCs/>
+          <w:noProof/>
           <w:sz w:val="36"/>
           <w:szCs w:val="36"/>
           <w:lang w:val="es-MX"/>
@@ -999,6 +1001,7 @@
         <w:rPr>
           <w:b/>
           <w:bCs/>
+          <w:noProof/>
           <w:sz w:val="36"/>
           <w:szCs w:val="36"/>
           <w:lang w:val="es-MX"/>
@@ -1091,6 +1094,7 @@
           <w:rFonts w:ascii="Arial Black" w:hAnsi="Arial Black"/>
           <w:b/>
           <w:bCs/>
+          <w:noProof/>
           <w:sz w:val="36"/>
           <w:szCs w:val="36"/>
           <w:lang w:val="es-MX"/>
@@ -1180,6 +1184,7 @@
         <w:rPr>
           <w:b/>
           <w:bCs/>
+          <w:noProof/>
           <w:sz w:val="36"/>
           <w:szCs w:val="36"/>
           <w:lang w:val="es-MX"/>
@@ -1220,6 +1225,1954 @@
           </wp:inline>
         </w:drawing>
       </w:r>
+    </w:p>
+    <w:p>
+      <w:pPr>
+        <w:rPr>
+          <w:b/>
+          <w:bCs/>
+          <w:sz w:val="36"/>
+          <w:szCs w:val="36"/>
+          <w:lang w:val="es-MX"/>
+        </w:rPr>
+      </w:pPr>
+      <w:r>
+        <w:rPr>
+          <w:b/>
+          <w:bCs/>
+          <w:sz w:val="36"/>
+          <w:szCs w:val="36"/>
+          <w:lang w:val="es-MX"/>
+        </w:rPr>
+        <w:br w:type="page"/>
+      </w:r>
+    </w:p>
+    <w:p>
+      <w:pPr>
+        <w:rPr>
+          <w:rFonts w:ascii="Arial Black" w:hAnsi="Arial Black"/>
+          <w:b/>
+          <w:bCs/>
+          <w:sz w:val="36"/>
+          <w:szCs w:val="36"/>
+          <w:lang w:val="es-MX"/>
+        </w:rPr>
+      </w:pPr>
+      <w:r>
+        <w:rPr>
+          <w:rFonts w:ascii="Arial Black" w:hAnsi="Arial Black"/>
+          <w:b/>
+          <w:bCs/>
+          <w:sz w:val="36"/>
+          <w:szCs w:val="36"/>
+          <w:lang w:val="es-MX"/>
+        </w:rPr>
+        <w:lastRenderedPageBreak/>
+        <w:t>E</w:t>
+      </w:r>
+      <w:r>
+        <w:rPr>
+          <w:rFonts w:ascii="Arial Black" w:hAnsi="Arial Black"/>
+          <w:b/>
+          <w:bCs/>
+          <w:sz w:val="36"/>
+          <w:szCs w:val="36"/>
+          <w:lang w:val="es-MX"/>
+        </w:rPr>
+        <w:t>6</w:t>
+      </w:r>
+    </w:p>
+    <w:p>
+      <w:pPr>
+        <w:rPr>
+          <w:rFonts w:ascii="Arial Black" w:hAnsi="Arial Black"/>
+          <w:b/>
+          <w:bCs/>
+          <w:sz w:val="36"/>
+          <w:szCs w:val="36"/>
+          <w:lang w:val="es-MX"/>
+        </w:rPr>
+      </w:pPr>
+      <w:r>
+        <w:rPr>
+          <w:rFonts w:ascii="Arial Black" w:hAnsi="Arial Black"/>
+          <w:b/>
+          <w:bCs/>
+          <w:sz w:val="36"/>
+          <w:szCs w:val="36"/>
+          <w:lang w:val="es-MX"/>
+        </w:rPr>
+        <w:drawing>
+          <wp:inline distT="0" distB="0" distL="0" distR="0" wp14:anchorId="3F85CA67" wp14:editId="0AB29E26">
+            <wp:extent cx="4286848" cy="743054"/>
+            <wp:effectExtent l="0" t="0" r="0" b="0"/>
+            <wp:docPr id="1980960637" name="Imagen 1"/>
+            <wp:cNvGraphicFramePr>
+              <a:graphicFrameLocks xmlns:a="http://schemas.openxmlformats.org/drawingml/2006/main" noChangeAspect="1"/>
+            </wp:cNvGraphicFramePr>
+            <a:graphic xmlns:a="http://schemas.openxmlformats.org/drawingml/2006/main">
+              <a:graphicData uri="http://schemas.openxmlformats.org/drawingml/2006/picture">
+                <pic:pic xmlns:pic="http://schemas.openxmlformats.org/drawingml/2006/picture">
+                  <pic:nvPicPr>
+                    <pic:cNvPr id="1980960637" name=""/>
+                    <pic:cNvPicPr/>
+                  </pic:nvPicPr>
+                  <pic:blipFill>
+                    <a:blip r:embed="rId19"/>
+                    <a:stretch>
+                      <a:fillRect/>
+                    </a:stretch>
+                  </pic:blipFill>
+                  <pic:spPr>
+                    <a:xfrm>
+                      <a:off x="0" y="0"/>
+                      <a:ext cx="4286848" cy="743054"/>
+                    </a:xfrm>
+                    <a:prstGeom prst="rect">
+                      <a:avLst/>
+                    </a:prstGeom>
+                  </pic:spPr>
+                </pic:pic>
+              </a:graphicData>
+            </a:graphic>
+          </wp:inline>
+        </w:drawing>
+      </w:r>
+    </w:p>
+    <w:p>
+      <w:pPr>
+        <w:rPr>
+          <w:rFonts w:ascii="Arial Black" w:hAnsi="Arial Black"/>
+          <w:b/>
+          <w:bCs/>
+          <w:sz w:val="36"/>
+          <w:szCs w:val="36"/>
+          <w:lang w:val="es-MX"/>
+        </w:rPr>
+      </w:pPr>
+      <w:r>
+        <w:rPr>
+          <w:rFonts w:ascii="Arial Black" w:hAnsi="Arial Black"/>
+          <w:b/>
+          <w:bCs/>
+          <w:sz w:val="36"/>
+          <w:szCs w:val="36"/>
+          <w:lang w:val="es-MX"/>
+        </w:rPr>
+        <w:t>E7</w:t>
+      </w:r>
+    </w:p>
+    <w:p>
+      <w:pPr>
+        <w:rPr>
+          <w:rFonts w:ascii="Arial Black" w:hAnsi="Arial Black"/>
+          <w:b/>
+          <w:bCs/>
+          <w:sz w:val="36"/>
+          <w:szCs w:val="36"/>
+          <w:lang w:val="es-MX"/>
+        </w:rPr>
+      </w:pPr>
+      <w:r>
+        <w:rPr>
+          <w:rFonts w:ascii="Arial Black" w:hAnsi="Arial Black"/>
+          <w:b/>
+          <w:bCs/>
+          <w:sz w:val="36"/>
+          <w:szCs w:val="36"/>
+          <w:lang w:val="es-MX"/>
+        </w:rPr>
+        <w:drawing>
+          <wp:inline distT="0" distB="0" distL="0" distR="0" wp14:anchorId="26EC6F70" wp14:editId="577BE857">
+            <wp:extent cx="4124901" cy="523948"/>
+            <wp:effectExtent l="0" t="0" r="9525" b="9525"/>
+            <wp:docPr id="1048322145" name="Imagen 1"/>
+            <wp:cNvGraphicFramePr>
+              <a:graphicFrameLocks xmlns:a="http://schemas.openxmlformats.org/drawingml/2006/main" noChangeAspect="1"/>
+            </wp:cNvGraphicFramePr>
+            <a:graphic xmlns:a="http://schemas.openxmlformats.org/drawingml/2006/main">
+              <a:graphicData uri="http://schemas.openxmlformats.org/drawingml/2006/picture">
+                <pic:pic xmlns:pic="http://schemas.openxmlformats.org/drawingml/2006/picture">
+                  <pic:nvPicPr>
+                    <pic:cNvPr id="1048322145" name=""/>
+                    <pic:cNvPicPr/>
+                  </pic:nvPicPr>
+                  <pic:blipFill>
+                    <a:blip r:embed="rId20"/>
+                    <a:stretch>
+                      <a:fillRect/>
+                    </a:stretch>
+                  </pic:blipFill>
+                  <pic:spPr>
+                    <a:xfrm>
+                      <a:off x="0" y="0"/>
+                      <a:ext cx="4124901" cy="523948"/>
+                    </a:xfrm>
+                    <a:prstGeom prst="rect">
+                      <a:avLst/>
+                    </a:prstGeom>
+                  </pic:spPr>
+                </pic:pic>
+              </a:graphicData>
+            </a:graphic>
+          </wp:inline>
+        </w:drawing>
+      </w:r>
+    </w:p>
+    <w:p>
+      <w:pPr>
+        <w:rPr>
+          <w:rFonts w:ascii="Arial Black" w:hAnsi="Arial Black"/>
+          <w:b/>
+          <w:bCs/>
+          <w:sz w:val="36"/>
+          <w:szCs w:val="36"/>
+          <w:lang w:val="es-MX"/>
+        </w:rPr>
+      </w:pPr>
+      <w:r>
+        <w:rPr>
+          <w:rFonts w:ascii="Arial Black" w:hAnsi="Arial Black"/>
+          <w:b/>
+          <w:bCs/>
+          <w:sz w:val="36"/>
+          <w:szCs w:val="36"/>
+          <w:lang w:val="es-MX"/>
+        </w:rPr>
+        <w:t>E8</w:t>
+      </w:r>
+    </w:p>
+    <w:p>
+      <w:pPr>
+        <w:rPr>
+          <w:rFonts w:ascii="Arial Black" w:hAnsi="Arial Black"/>
+          <w:b/>
+          <w:bCs/>
+          <w:sz w:val="36"/>
+          <w:szCs w:val="36"/>
+          <w:lang w:val="es-MX"/>
+        </w:rPr>
+      </w:pPr>
+      <w:r>
+        <w:rPr>
+          <w:rFonts w:ascii="Arial Black" w:hAnsi="Arial Black"/>
+          <w:b/>
+          <w:bCs/>
+          <w:sz w:val="36"/>
+          <w:szCs w:val="36"/>
+          <w:lang w:val="es-MX"/>
+        </w:rPr>
+        <w:drawing>
+          <wp:inline distT="0" distB="0" distL="0" distR="0" wp14:anchorId="6BCB831A" wp14:editId="79716D95">
+            <wp:extent cx="3238952" cy="876422"/>
+            <wp:effectExtent l="0" t="0" r="0" b="0"/>
+            <wp:docPr id="1267644189" name="Imagen 1"/>
+            <wp:cNvGraphicFramePr>
+              <a:graphicFrameLocks xmlns:a="http://schemas.openxmlformats.org/drawingml/2006/main" noChangeAspect="1"/>
+            </wp:cNvGraphicFramePr>
+            <a:graphic xmlns:a="http://schemas.openxmlformats.org/drawingml/2006/main">
+              <a:graphicData uri="http://schemas.openxmlformats.org/drawingml/2006/picture">
+                <pic:pic xmlns:pic="http://schemas.openxmlformats.org/drawingml/2006/picture">
+                  <pic:nvPicPr>
+                    <pic:cNvPr id="1267644189" name=""/>
+                    <pic:cNvPicPr/>
+                  </pic:nvPicPr>
+                  <pic:blipFill>
+                    <a:blip r:embed="rId21"/>
+                    <a:stretch>
+                      <a:fillRect/>
+                    </a:stretch>
+                  </pic:blipFill>
+                  <pic:spPr>
+                    <a:xfrm>
+                      <a:off x="0" y="0"/>
+                      <a:ext cx="3238952" cy="876422"/>
+                    </a:xfrm>
+                    <a:prstGeom prst="rect">
+                      <a:avLst/>
+                    </a:prstGeom>
+                  </pic:spPr>
+                </pic:pic>
+              </a:graphicData>
+            </a:graphic>
+          </wp:inline>
+        </w:drawing>
+      </w:r>
+    </w:p>
+    <w:p>
+      <w:pPr>
+        <w:rPr>
+          <w:rFonts w:ascii="Arial Black" w:hAnsi="Arial Black"/>
+          <w:b/>
+          <w:bCs/>
+          <w:sz w:val="36"/>
+          <w:szCs w:val="36"/>
+          <w:lang w:val="es-MX"/>
+        </w:rPr>
+      </w:pPr>
+      <w:r>
+        <w:rPr>
+          <w:rFonts w:ascii="Arial Black" w:hAnsi="Arial Black"/>
+          <w:b/>
+          <w:bCs/>
+          <w:sz w:val="36"/>
+          <w:szCs w:val="36"/>
+          <w:lang w:val="es-MX"/>
+        </w:rPr>
+        <w:t>E9</w:t>
+      </w:r>
+    </w:p>
+    <w:p>
+      <w:pPr>
+        <w:rPr>
+          <w:rFonts w:ascii="Arial Black" w:hAnsi="Arial Black"/>
+          <w:b/>
+          <w:bCs/>
+          <w:sz w:val="36"/>
+          <w:szCs w:val="36"/>
+          <w:lang w:val="es-MX"/>
+        </w:rPr>
+      </w:pPr>
+      <w:r>
+        <w:rPr>
+          <w:rFonts w:ascii="Arial Black" w:hAnsi="Arial Black"/>
+          <w:b/>
+          <w:bCs/>
+          <w:sz w:val="36"/>
+          <w:szCs w:val="36"/>
+          <w:lang w:val="es-MX"/>
+        </w:rPr>
+        <w:drawing>
+          <wp:inline distT="0" distB="0" distL="0" distR="0" wp14:anchorId="2F7EF301" wp14:editId="343D26FC">
+            <wp:extent cx="4172532" cy="562053"/>
+            <wp:effectExtent l="0" t="0" r="0" b="9525"/>
+            <wp:docPr id="264960871" name="Imagen 1"/>
+            <wp:cNvGraphicFramePr>
+              <a:graphicFrameLocks xmlns:a="http://schemas.openxmlformats.org/drawingml/2006/main" noChangeAspect="1"/>
+            </wp:cNvGraphicFramePr>
+            <a:graphic xmlns:a="http://schemas.openxmlformats.org/drawingml/2006/main">
+              <a:graphicData uri="http://schemas.openxmlformats.org/drawingml/2006/picture">
+                <pic:pic xmlns:pic="http://schemas.openxmlformats.org/drawingml/2006/picture">
+                  <pic:nvPicPr>
+                    <pic:cNvPr id="264960871" name=""/>
+                    <pic:cNvPicPr/>
+                  </pic:nvPicPr>
+                  <pic:blipFill>
+                    <a:blip r:embed="rId22"/>
+                    <a:stretch>
+                      <a:fillRect/>
+                    </a:stretch>
+                  </pic:blipFill>
+                  <pic:spPr>
+                    <a:xfrm>
+                      <a:off x="0" y="0"/>
+                      <a:ext cx="4172532" cy="562053"/>
+                    </a:xfrm>
+                    <a:prstGeom prst="rect">
+                      <a:avLst/>
+                    </a:prstGeom>
+                  </pic:spPr>
+                </pic:pic>
+              </a:graphicData>
+            </a:graphic>
+          </wp:inline>
+        </w:drawing>
+      </w:r>
+    </w:p>
+    <w:p>
+      <w:pPr>
+        <w:rPr>
+          <w:rFonts w:ascii="Arial Black" w:hAnsi="Arial Black"/>
+          <w:b/>
+          <w:bCs/>
+          <w:sz w:val="36"/>
+          <w:szCs w:val="36"/>
+          <w:lang w:val="es-MX"/>
+        </w:rPr>
+      </w:pPr>
+      <w:r>
+        <w:rPr>
+          <w:rFonts w:ascii="Arial Black" w:hAnsi="Arial Black"/>
+          <w:b/>
+          <w:bCs/>
+          <w:sz w:val="36"/>
+          <w:szCs w:val="36"/>
+          <w:lang w:val="es-MX"/>
+        </w:rPr>
+        <w:t>E10</w:t>
+      </w:r>
+    </w:p>
+    <w:p>
+      <w:pPr>
+        <w:rPr>
+          <w:rFonts w:ascii="Arial Black" w:hAnsi="Arial Black"/>
+          <w:b/>
+          <w:bCs/>
+          <w:sz w:val="36"/>
+          <w:szCs w:val="36"/>
+          <w:lang w:val="es-MX"/>
+        </w:rPr>
+      </w:pPr>
+      <w:r>
+        <w:rPr>
+          <w:rFonts w:ascii="Arial Black" w:hAnsi="Arial Black"/>
+          <w:b/>
+          <w:bCs/>
+          <w:sz w:val="36"/>
+          <w:szCs w:val="36"/>
+          <w:lang w:val="es-MX"/>
+        </w:rPr>
+        <w:drawing>
+          <wp:inline distT="0" distB="0" distL="0" distR="0" wp14:anchorId="3F583070" wp14:editId="5347365C">
+            <wp:extent cx="4270977" cy="971550"/>
+            <wp:effectExtent l="0" t="0" r="0" b="0"/>
+            <wp:docPr id="53278535" name="Imagen 1"/>
+            <wp:cNvGraphicFramePr>
+              <a:graphicFrameLocks xmlns:a="http://schemas.openxmlformats.org/drawingml/2006/main" noChangeAspect="1"/>
+            </wp:cNvGraphicFramePr>
+            <a:graphic xmlns:a="http://schemas.openxmlformats.org/drawingml/2006/main">
+              <a:graphicData uri="http://schemas.openxmlformats.org/drawingml/2006/picture">
+                <pic:pic xmlns:pic="http://schemas.openxmlformats.org/drawingml/2006/picture">
+                  <pic:nvPicPr>
+                    <pic:cNvPr id="53278535" name=""/>
+                    <pic:cNvPicPr/>
+                  </pic:nvPicPr>
+                  <pic:blipFill>
+                    <a:blip r:embed="rId23"/>
+                    <a:stretch>
+                      <a:fillRect/>
+                    </a:stretch>
+                  </pic:blipFill>
+                  <pic:spPr>
+                    <a:xfrm>
+                      <a:off x="0" y="0"/>
+                      <a:ext cx="4291016" cy="976108"/>
+                    </a:xfrm>
+                    <a:prstGeom prst="rect">
+                      <a:avLst/>
+                    </a:prstGeom>
+                  </pic:spPr>
+                </pic:pic>
+              </a:graphicData>
+            </a:graphic>
+          </wp:inline>
+        </w:drawing>
+      </w:r>
+    </w:p>
+    <w:p>
+      <w:pPr>
+        <w:rPr>
+          <w:b/>
+          <w:bCs/>
+          <w:sz w:val="36"/>
+          <w:szCs w:val="36"/>
+          <w:lang w:val="es-MX"/>
+        </w:rPr>
+      </w:pPr>
+    </w:p>
+    <w:p>
+      <w:pPr>
+        <w:rPr>
+          <w:b/>
+          <w:bCs/>
+          <w:sz w:val="36"/>
+          <w:szCs w:val="36"/>
+          <w:lang w:val="es-MX"/>
+        </w:rPr>
+      </w:pPr>
+    </w:p>
+    <w:p>
+      <w:pPr>
+        <w:rPr>
+          <w:b/>
+          <w:bCs/>
+          <w:sz w:val="36"/>
+          <w:szCs w:val="36"/>
+          <w:lang w:val="es-MX"/>
+        </w:rPr>
+      </w:pPr>
+    </w:p>
+    <w:p>
+      <w:pPr>
+        <w:rPr>
+          <w:b/>
+          <w:bCs/>
+          <w:sz w:val="36"/>
+          <w:szCs w:val="36"/>
+          <w:lang w:val="es-MX"/>
+        </w:rPr>
+      </w:pPr>
+      <w:r>
+        <w:rPr>
+          <w:b/>
+          <w:bCs/>
+          <w:sz w:val="36"/>
+          <w:szCs w:val="36"/>
+          <w:lang w:val="es-MX"/>
+        </w:rPr>
+        <w:lastRenderedPageBreak/>
+        <w:t>EP1</w:t>
+      </w:r>
+    </w:p>
+    <w:p>
+      <w:pPr>
+        <w:rPr>
+          <w:b/>
+          <w:bCs/>
+          <w:sz w:val="36"/>
+          <w:szCs w:val="36"/>
+          <w:lang w:val="es-MX"/>
+        </w:rPr>
+      </w:pPr>
+      <w:r>
+        <w:rPr>
+          <w:b/>
+          <w:bCs/>
+          <w:sz w:val="36"/>
+          <w:szCs w:val="36"/>
+          <w:lang w:val="es-MX"/>
+        </w:rPr>
+        <w:drawing>
+          <wp:inline distT="0" distB="0" distL="0" distR="0" wp14:anchorId="3D9ACC80" wp14:editId="1F9E55A5">
+            <wp:extent cx="3978025" cy="2000250"/>
+            <wp:effectExtent l="0" t="0" r="3810" b="0"/>
+            <wp:docPr id="894545203" name="Imagen 1"/>
+            <wp:cNvGraphicFramePr>
+              <a:graphicFrameLocks xmlns:a="http://schemas.openxmlformats.org/drawingml/2006/main" noChangeAspect="1"/>
+            </wp:cNvGraphicFramePr>
+            <a:graphic xmlns:a="http://schemas.openxmlformats.org/drawingml/2006/main">
+              <a:graphicData uri="http://schemas.openxmlformats.org/drawingml/2006/picture">
+                <pic:pic xmlns:pic="http://schemas.openxmlformats.org/drawingml/2006/picture">
+                  <pic:nvPicPr>
+                    <pic:cNvPr id="894545203" name=""/>
+                    <pic:cNvPicPr/>
+                  </pic:nvPicPr>
+                  <pic:blipFill>
+                    <a:blip r:embed="rId24"/>
+                    <a:stretch>
+                      <a:fillRect/>
+                    </a:stretch>
+                  </pic:blipFill>
+                  <pic:spPr>
+                    <a:xfrm>
+                      <a:off x="0" y="0"/>
+                      <a:ext cx="3980384" cy="2001436"/>
+                    </a:xfrm>
+                    <a:prstGeom prst="rect">
+                      <a:avLst/>
+                    </a:prstGeom>
+                  </pic:spPr>
+                </pic:pic>
+              </a:graphicData>
+            </a:graphic>
+          </wp:inline>
+        </w:drawing>
+      </w:r>
+    </w:p>
+    <w:p>
+      <w:pPr>
+        <w:rPr>
+          <w:b/>
+          <w:bCs/>
+          <w:sz w:val="36"/>
+          <w:szCs w:val="36"/>
+          <w:lang w:val="es-MX"/>
+        </w:rPr>
+      </w:pPr>
+      <w:r>
+        <w:rPr>
+          <w:b/>
+          <w:bCs/>
+          <w:sz w:val="36"/>
+          <w:szCs w:val="36"/>
+          <w:lang w:val="es-MX"/>
+        </w:rPr>
+        <w:drawing>
+          <wp:inline distT="0" distB="0" distL="0" distR="0" wp14:anchorId="0621BB85" wp14:editId="57238EFE">
+            <wp:extent cx="2005656" cy="466725"/>
+            <wp:effectExtent l="0" t="0" r="0" b="0"/>
+            <wp:docPr id="2103578914" name="Imagen 1"/>
+            <wp:cNvGraphicFramePr>
+              <a:graphicFrameLocks xmlns:a="http://schemas.openxmlformats.org/drawingml/2006/main" noChangeAspect="1"/>
+            </wp:cNvGraphicFramePr>
+            <a:graphic xmlns:a="http://schemas.openxmlformats.org/drawingml/2006/main">
+              <a:graphicData uri="http://schemas.openxmlformats.org/drawingml/2006/picture">
+                <pic:pic xmlns:pic="http://schemas.openxmlformats.org/drawingml/2006/picture">
+                  <pic:nvPicPr>
+                    <pic:cNvPr id="2103578914" name=""/>
+                    <pic:cNvPicPr/>
+                  </pic:nvPicPr>
+                  <pic:blipFill>
+                    <a:blip r:embed="rId25"/>
+                    <a:stretch>
+                      <a:fillRect/>
+                    </a:stretch>
+                  </pic:blipFill>
+                  <pic:spPr>
+                    <a:xfrm>
+                      <a:off x="0" y="0"/>
+                      <a:ext cx="2010344" cy="467816"/>
+                    </a:xfrm>
+                    <a:prstGeom prst="rect">
+                      <a:avLst/>
+                    </a:prstGeom>
+                  </pic:spPr>
+                </pic:pic>
+              </a:graphicData>
+            </a:graphic>
+          </wp:inline>
+        </w:drawing>
+      </w:r>
+    </w:p>
+    <w:p>
+      <w:pPr>
+        <w:rPr>
+          <w:b/>
+          <w:bCs/>
+          <w:sz w:val="36"/>
+          <w:szCs w:val="36"/>
+          <w:lang w:val="es-MX"/>
+        </w:rPr>
+      </w:pPr>
+      <w:r>
+        <w:rPr>
+          <w:b/>
+          <w:bCs/>
+          <w:sz w:val="36"/>
+          <w:szCs w:val="36"/>
+          <w:lang w:val="es-MX"/>
+        </w:rPr>
+        <w:t>EP</w:t>
+      </w:r>
+      <w:r>
+        <w:rPr>
+          <w:b/>
+          <w:bCs/>
+          <w:sz w:val="36"/>
+          <w:szCs w:val="36"/>
+          <w:lang w:val="es-MX"/>
+        </w:rPr>
+        <w:t>2</w:t>
+      </w:r>
+    </w:p>
+    <w:p>
+      <w:pPr>
+        <w:rPr>
+          <w:b/>
+          <w:bCs/>
+          <w:sz w:val="36"/>
+          <w:szCs w:val="36"/>
+          <w:lang w:val="es-MX"/>
+        </w:rPr>
+      </w:pPr>
+      <w:r>
+        <w:rPr>
+          <w:b/>
+          <w:bCs/>
+          <w:sz w:val="36"/>
+          <w:szCs w:val="36"/>
+          <w:lang w:val="es-MX"/>
+        </w:rPr>
+        <w:drawing>
+          <wp:inline distT="0" distB="0" distL="0" distR="0" wp14:anchorId="52A3B5B0" wp14:editId="3BA347B0">
+            <wp:extent cx="4318000" cy="2190750"/>
+            <wp:effectExtent l="0" t="0" r="6350" b="0"/>
+            <wp:docPr id="1026624652" name="Imagen 1"/>
+            <wp:cNvGraphicFramePr>
+              <a:graphicFrameLocks xmlns:a="http://schemas.openxmlformats.org/drawingml/2006/main" noChangeAspect="1"/>
+            </wp:cNvGraphicFramePr>
+            <a:graphic xmlns:a="http://schemas.openxmlformats.org/drawingml/2006/main">
+              <a:graphicData uri="http://schemas.openxmlformats.org/drawingml/2006/picture">
+                <pic:pic xmlns:pic="http://schemas.openxmlformats.org/drawingml/2006/picture">
+                  <pic:nvPicPr>
+                    <pic:cNvPr id="1026624652" name=""/>
+                    <pic:cNvPicPr/>
+                  </pic:nvPicPr>
+                  <pic:blipFill>
+                    <a:blip r:embed="rId26"/>
+                    <a:stretch>
+                      <a:fillRect/>
+                    </a:stretch>
+                  </pic:blipFill>
+                  <pic:spPr>
+                    <a:xfrm>
+                      <a:off x="0" y="0"/>
+                      <a:ext cx="4318897" cy="2191205"/>
+                    </a:xfrm>
+                    <a:prstGeom prst="rect">
+                      <a:avLst/>
+                    </a:prstGeom>
+                  </pic:spPr>
+                </pic:pic>
+              </a:graphicData>
+            </a:graphic>
+          </wp:inline>
+        </w:drawing>
+      </w:r>
+    </w:p>
+    <w:p>
+      <w:pPr>
+        <w:rPr>
+          <w:b/>
+          <w:bCs/>
+          <w:sz w:val="36"/>
+          <w:szCs w:val="36"/>
+          <w:lang w:val="es-MX"/>
+        </w:rPr>
+      </w:pPr>
+      <w:r>
+        <w:rPr>
+          <w:b/>
+          <w:bCs/>
+          <w:sz w:val="36"/>
+          <w:szCs w:val="36"/>
+          <w:lang w:val="es-MX"/>
+        </w:rPr>
+        <w:drawing>
+          <wp:inline distT="0" distB="0" distL="0" distR="0" wp14:anchorId="6161DEEC" wp14:editId="67A737F4">
+            <wp:extent cx="2534798" cy="600075"/>
+            <wp:effectExtent l="0" t="0" r="0" b="0"/>
+            <wp:docPr id="1433992420" name="Imagen 1"/>
+            <wp:cNvGraphicFramePr>
+              <a:graphicFrameLocks xmlns:a="http://schemas.openxmlformats.org/drawingml/2006/main" noChangeAspect="1"/>
+            </wp:cNvGraphicFramePr>
+            <a:graphic xmlns:a="http://schemas.openxmlformats.org/drawingml/2006/main">
+              <a:graphicData uri="http://schemas.openxmlformats.org/drawingml/2006/picture">
+                <pic:pic xmlns:pic="http://schemas.openxmlformats.org/drawingml/2006/picture">
+                  <pic:nvPicPr>
+                    <pic:cNvPr id="1433992420" name=""/>
+                    <pic:cNvPicPr/>
+                  </pic:nvPicPr>
+                  <pic:blipFill>
+                    <a:blip r:embed="rId27"/>
+                    <a:stretch>
+                      <a:fillRect/>
+                    </a:stretch>
+                  </pic:blipFill>
+                  <pic:spPr>
+                    <a:xfrm>
+                      <a:off x="0" y="0"/>
+                      <a:ext cx="2565660" cy="607381"/>
+                    </a:xfrm>
+                    <a:prstGeom prst="rect">
+                      <a:avLst/>
+                    </a:prstGeom>
+                  </pic:spPr>
+                </pic:pic>
+              </a:graphicData>
+            </a:graphic>
+          </wp:inline>
+        </w:drawing>
+      </w:r>
+      <w:r>
+        <w:rPr>
+          <w:b/>
+          <w:bCs/>
+          <w:sz w:val="36"/>
+          <w:szCs w:val="36"/>
+          <w:lang w:val="es-MX"/>
+        </w:rPr>
+        <w:br w:type="page"/>
+      </w:r>
+    </w:p>
+    <w:p>
+      <w:pPr>
+        <w:rPr>
+          <w:b/>
+          <w:bCs/>
+          <w:sz w:val="36"/>
+          <w:szCs w:val="36"/>
+          <w:lang w:val="es-MX"/>
+        </w:rPr>
+      </w:pPr>
+      <w:r>
+        <w:rPr>
+          <w:b/>
+          <w:bCs/>
+          <w:sz w:val="36"/>
+          <w:szCs w:val="36"/>
+          <w:lang w:val="es-MX"/>
+        </w:rPr>
+        <w:lastRenderedPageBreak/>
+        <w:t>EP</w:t>
+      </w:r>
+      <w:r>
+        <w:rPr>
+          <w:b/>
+          <w:bCs/>
+          <w:sz w:val="36"/>
+          <w:szCs w:val="36"/>
+          <w:lang w:val="es-MX"/>
+        </w:rPr>
+        <w:t>3</w:t>
+      </w:r>
+    </w:p>
+    <w:p>
+      <w:pPr>
+        <w:rPr>
+          <w:b/>
+          <w:bCs/>
+          <w:sz w:val="36"/>
+          <w:szCs w:val="36"/>
+          <w:lang w:val="es-MX"/>
+        </w:rPr>
+      </w:pPr>
+      <w:r>
+        <w:rPr>
+          <w:b/>
+          <w:bCs/>
+          <w:sz w:val="36"/>
+          <w:szCs w:val="36"/>
+          <w:lang w:val="es-MX"/>
+        </w:rPr>
+        <w:drawing>
+          <wp:inline distT="0" distB="0" distL="0" distR="0" wp14:anchorId="77A56D60" wp14:editId="2061E90C">
+            <wp:extent cx="4591691" cy="1943371"/>
+            <wp:effectExtent l="0" t="0" r="0" b="0"/>
+            <wp:docPr id="1979851419" name="Imagen 1"/>
+            <wp:cNvGraphicFramePr>
+              <a:graphicFrameLocks xmlns:a="http://schemas.openxmlformats.org/drawingml/2006/main" noChangeAspect="1"/>
+            </wp:cNvGraphicFramePr>
+            <a:graphic xmlns:a="http://schemas.openxmlformats.org/drawingml/2006/main">
+              <a:graphicData uri="http://schemas.openxmlformats.org/drawingml/2006/picture">
+                <pic:pic xmlns:pic="http://schemas.openxmlformats.org/drawingml/2006/picture">
+                  <pic:nvPicPr>
+                    <pic:cNvPr id="1979851419" name=""/>
+                    <pic:cNvPicPr/>
+                  </pic:nvPicPr>
+                  <pic:blipFill>
+                    <a:blip r:embed="rId28"/>
+                    <a:stretch>
+                      <a:fillRect/>
+                    </a:stretch>
+                  </pic:blipFill>
+                  <pic:spPr>
+                    <a:xfrm>
+                      <a:off x="0" y="0"/>
+                      <a:ext cx="4591691" cy="1943371"/>
+                    </a:xfrm>
+                    <a:prstGeom prst="rect">
+                      <a:avLst/>
+                    </a:prstGeom>
+                  </pic:spPr>
+                </pic:pic>
+              </a:graphicData>
+            </a:graphic>
+          </wp:inline>
+        </w:drawing>
+      </w:r>
+    </w:p>
+    <w:p>
+      <w:pPr>
+        <w:rPr>
+          <w:b/>
+          <w:bCs/>
+          <w:sz w:val="36"/>
+          <w:szCs w:val="36"/>
+          <w:lang w:val="es-MX"/>
+        </w:rPr>
+      </w:pPr>
+      <w:r>
+        <w:rPr>
+          <w:b/>
+          <w:bCs/>
+          <w:sz w:val="36"/>
+          <w:szCs w:val="36"/>
+          <w:lang w:val="es-MX"/>
+        </w:rPr>
+        <w:drawing>
+          <wp:inline distT="0" distB="0" distL="0" distR="0" wp14:anchorId="41950EFC" wp14:editId="24860AB8">
+            <wp:extent cx="2329962" cy="714375"/>
+            <wp:effectExtent l="0" t="0" r="0" b="0"/>
+            <wp:docPr id="1067727798" name="Imagen 1"/>
+            <wp:cNvGraphicFramePr>
+              <a:graphicFrameLocks xmlns:a="http://schemas.openxmlformats.org/drawingml/2006/main" noChangeAspect="1"/>
+            </wp:cNvGraphicFramePr>
+            <a:graphic xmlns:a="http://schemas.openxmlformats.org/drawingml/2006/main">
+              <a:graphicData uri="http://schemas.openxmlformats.org/drawingml/2006/picture">
+                <pic:pic xmlns:pic="http://schemas.openxmlformats.org/drawingml/2006/picture">
+                  <pic:nvPicPr>
+                    <pic:cNvPr id="1067727798" name=""/>
+                    <pic:cNvPicPr/>
+                  </pic:nvPicPr>
+                  <pic:blipFill>
+                    <a:blip r:embed="rId29"/>
+                    <a:stretch>
+                      <a:fillRect/>
+                    </a:stretch>
+                  </pic:blipFill>
+                  <pic:spPr>
+                    <a:xfrm>
+                      <a:off x="0" y="0"/>
+                      <a:ext cx="2330632" cy="714580"/>
+                    </a:xfrm>
+                    <a:prstGeom prst="rect">
+                      <a:avLst/>
+                    </a:prstGeom>
+                  </pic:spPr>
+                </pic:pic>
+              </a:graphicData>
+            </a:graphic>
+          </wp:inline>
+        </w:drawing>
+      </w:r>
+    </w:p>
+    <w:p>
+      <w:pPr>
+        <w:rPr>
+          <w:b/>
+          <w:bCs/>
+          <w:sz w:val="36"/>
+          <w:szCs w:val="36"/>
+          <w:lang w:val="es-MX"/>
+        </w:rPr>
+      </w:pPr>
+      <w:r>
+        <w:rPr>
+          <w:b/>
+          <w:bCs/>
+          <w:sz w:val="36"/>
+          <w:szCs w:val="36"/>
+          <w:lang w:val="es-MX"/>
+        </w:rPr>
+        <w:t>EP</w:t>
+      </w:r>
+      <w:r>
+        <w:rPr>
+          <w:b/>
+          <w:bCs/>
+          <w:sz w:val="36"/>
+          <w:szCs w:val="36"/>
+          <w:lang w:val="es-MX"/>
+        </w:rPr>
+        <w:t>4</w:t>
+      </w:r>
+    </w:p>
+    <w:p>
+      <w:pPr>
+        <w:rPr>
+          <w:b/>
+          <w:bCs/>
+          <w:sz w:val="36"/>
+          <w:szCs w:val="36"/>
+          <w:lang w:val="es-MX"/>
+        </w:rPr>
+      </w:pPr>
+      <w:r>
+        <w:rPr>
+          <w:b/>
+          <w:bCs/>
+          <w:sz w:val="36"/>
+          <w:szCs w:val="36"/>
+          <w:lang w:val="es-MX"/>
+        </w:rPr>
+        <w:drawing>
+          <wp:inline distT="0" distB="0" distL="0" distR="0" wp14:anchorId="6F23C8E3" wp14:editId="4ADEA34D">
+            <wp:extent cx="4505954" cy="1829055"/>
+            <wp:effectExtent l="0" t="0" r="9525" b="0"/>
+            <wp:docPr id="1807239875" name="Imagen 1"/>
+            <wp:cNvGraphicFramePr>
+              <a:graphicFrameLocks xmlns:a="http://schemas.openxmlformats.org/drawingml/2006/main" noChangeAspect="1"/>
+            </wp:cNvGraphicFramePr>
+            <a:graphic xmlns:a="http://schemas.openxmlformats.org/drawingml/2006/main">
+              <a:graphicData uri="http://schemas.openxmlformats.org/drawingml/2006/picture">
+                <pic:pic xmlns:pic="http://schemas.openxmlformats.org/drawingml/2006/picture">
+                  <pic:nvPicPr>
+                    <pic:cNvPr id="1807239875" name=""/>
+                    <pic:cNvPicPr/>
+                  </pic:nvPicPr>
+                  <pic:blipFill>
+                    <a:blip r:embed="rId30"/>
+                    <a:stretch>
+                      <a:fillRect/>
+                    </a:stretch>
+                  </pic:blipFill>
+                  <pic:spPr>
+                    <a:xfrm>
+                      <a:off x="0" y="0"/>
+                      <a:ext cx="4505954" cy="1829055"/>
+                    </a:xfrm>
+                    <a:prstGeom prst="rect">
+                      <a:avLst/>
+                    </a:prstGeom>
+                  </pic:spPr>
+                </pic:pic>
+              </a:graphicData>
+            </a:graphic>
+          </wp:inline>
+        </w:drawing>
+      </w:r>
+    </w:p>
+    <w:p>
+      <w:pPr>
+        <w:rPr>
+          <w:b/>
+          <w:bCs/>
+          <w:sz w:val="36"/>
+          <w:szCs w:val="36"/>
+          <w:lang w:val="es-MX"/>
+        </w:rPr>
+      </w:pPr>
+      <w:r>
+        <w:rPr>
+          <w:b/>
+          <w:bCs/>
+          <w:sz w:val="36"/>
+          <w:szCs w:val="36"/>
+          <w:lang w:val="es-MX"/>
+        </w:rPr>
+        <w:drawing>
+          <wp:inline distT="0" distB="0" distL="0" distR="0" wp14:anchorId="14CC866C" wp14:editId="46AD49B3">
+            <wp:extent cx="1609725" cy="369937"/>
+            <wp:effectExtent l="0" t="0" r="0" b="0"/>
+            <wp:docPr id="1463677648" name="Imagen 1"/>
+            <wp:cNvGraphicFramePr>
+              <a:graphicFrameLocks xmlns:a="http://schemas.openxmlformats.org/drawingml/2006/main" noChangeAspect="1"/>
+            </wp:cNvGraphicFramePr>
+            <a:graphic xmlns:a="http://schemas.openxmlformats.org/drawingml/2006/main">
+              <a:graphicData uri="http://schemas.openxmlformats.org/drawingml/2006/picture">
+                <pic:pic xmlns:pic="http://schemas.openxmlformats.org/drawingml/2006/picture">
+                  <pic:nvPicPr>
+                    <pic:cNvPr id="1463677648" name=""/>
+                    <pic:cNvPicPr/>
+                  </pic:nvPicPr>
+                  <pic:blipFill>
+                    <a:blip r:embed="rId31"/>
+                    <a:stretch>
+                      <a:fillRect/>
+                    </a:stretch>
+                  </pic:blipFill>
+                  <pic:spPr>
+                    <a:xfrm>
+                      <a:off x="0" y="0"/>
+                      <a:ext cx="1612887" cy="370664"/>
+                    </a:xfrm>
+                    <a:prstGeom prst="rect">
+                      <a:avLst/>
+                    </a:prstGeom>
+                  </pic:spPr>
+                </pic:pic>
+              </a:graphicData>
+            </a:graphic>
+          </wp:inline>
+        </w:drawing>
+      </w:r>
+    </w:p>
+    <w:p>
+      <w:pPr>
+        <w:rPr>
+          <w:b/>
+          <w:bCs/>
+          <w:sz w:val="36"/>
+          <w:szCs w:val="36"/>
+          <w:lang w:val="es-MX"/>
+        </w:rPr>
+      </w:pPr>
+    </w:p>
+    <w:p>
+      <w:pPr>
+        <w:rPr>
+          <w:b/>
+          <w:bCs/>
+          <w:sz w:val="36"/>
+          <w:szCs w:val="36"/>
+          <w:lang w:val="es-MX"/>
+        </w:rPr>
+      </w:pPr>
+    </w:p>
+    <w:p>
+      <w:pPr>
+        <w:rPr>
+          <w:b/>
+          <w:bCs/>
+          <w:sz w:val="36"/>
+          <w:szCs w:val="36"/>
+          <w:lang w:val="es-MX"/>
+        </w:rPr>
+      </w:pPr>
+    </w:p>
+    <w:p>
+      <w:pPr>
+        <w:rPr>
+          <w:b/>
+          <w:bCs/>
+          <w:sz w:val="36"/>
+          <w:szCs w:val="36"/>
+          <w:lang w:val="es-MX"/>
+        </w:rPr>
+      </w:pPr>
+    </w:p>
+    <w:p>
+      <w:pPr>
+        <w:rPr>
+          <w:b/>
+          <w:bCs/>
+          <w:sz w:val="36"/>
+          <w:szCs w:val="36"/>
+          <w:lang w:val="es-MX"/>
+        </w:rPr>
+      </w:pPr>
+      <w:r>
+        <w:rPr>
+          <w:b/>
+          <w:bCs/>
+          <w:sz w:val="36"/>
+          <w:szCs w:val="36"/>
+          <w:lang w:val="es-MX"/>
+        </w:rPr>
+        <w:lastRenderedPageBreak/>
+        <w:t>EP</w:t>
+      </w:r>
+      <w:r>
+        <w:rPr>
+          <w:b/>
+          <w:bCs/>
+          <w:sz w:val="36"/>
+          <w:szCs w:val="36"/>
+          <w:lang w:val="es-MX"/>
+        </w:rPr>
+        <w:t>5</w:t>
+      </w:r>
+    </w:p>
+    <w:p>
+      <w:pPr>
+        <w:rPr>
+          <w:b/>
+          <w:bCs/>
+          <w:sz w:val="36"/>
+          <w:szCs w:val="36"/>
+          <w:lang w:val="es-MX"/>
+        </w:rPr>
+      </w:pPr>
+      <w:r>
+        <w:rPr>
+          <w:b/>
+          <w:bCs/>
+          <w:sz w:val="36"/>
+          <w:szCs w:val="36"/>
+          <w:lang w:val="es-MX"/>
+        </w:rPr>
+        <w:drawing>
+          <wp:inline distT="0" distB="0" distL="0" distR="0" wp14:anchorId="0585EC69" wp14:editId="7DCB1D61">
+            <wp:extent cx="5277587" cy="1914792"/>
+            <wp:effectExtent l="0" t="0" r="0" b="9525"/>
+            <wp:docPr id="1655023043" name="Imagen 1"/>
+            <wp:cNvGraphicFramePr>
+              <a:graphicFrameLocks xmlns:a="http://schemas.openxmlformats.org/drawingml/2006/main" noChangeAspect="1"/>
+            </wp:cNvGraphicFramePr>
+            <a:graphic xmlns:a="http://schemas.openxmlformats.org/drawingml/2006/main">
+              <a:graphicData uri="http://schemas.openxmlformats.org/drawingml/2006/picture">
+                <pic:pic xmlns:pic="http://schemas.openxmlformats.org/drawingml/2006/picture">
+                  <pic:nvPicPr>
+                    <pic:cNvPr id="1655023043" name=""/>
+                    <pic:cNvPicPr/>
+                  </pic:nvPicPr>
+                  <pic:blipFill>
+                    <a:blip r:embed="rId32"/>
+                    <a:stretch>
+                      <a:fillRect/>
+                    </a:stretch>
+                  </pic:blipFill>
+                  <pic:spPr>
+                    <a:xfrm>
+                      <a:off x="0" y="0"/>
+                      <a:ext cx="5277587" cy="1914792"/>
+                    </a:xfrm>
+                    <a:prstGeom prst="rect">
+                      <a:avLst/>
+                    </a:prstGeom>
+                  </pic:spPr>
+                </pic:pic>
+              </a:graphicData>
+            </a:graphic>
+          </wp:inline>
+        </w:drawing>
+      </w:r>
+    </w:p>
+    <w:p>
+      <w:pPr>
+        <w:rPr>
+          <w:b/>
+          <w:bCs/>
+          <w:sz w:val="36"/>
+          <w:szCs w:val="36"/>
+          <w:lang w:val="es-MX"/>
+        </w:rPr>
+      </w:pPr>
+      <w:r>
+        <w:rPr>
+          <w:b/>
+          <w:bCs/>
+          <w:sz w:val="36"/>
+          <w:szCs w:val="36"/>
+          <w:lang w:val="es-MX"/>
+        </w:rPr>
+        <w:drawing>
+          <wp:inline distT="0" distB="0" distL="0" distR="0" wp14:anchorId="019D71A0" wp14:editId="101CBA01">
+            <wp:extent cx="2819794" cy="552527"/>
+            <wp:effectExtent l="0" t="0" r="0" b="0"/>
+            <wp:docPr id="1645218508" name="Imagen 1"/>
+            <wp:cNvGraphicFramePr>
+              <a:graphicFrameLocks xmlns:a="http://schemas.openxmlformats.org/drawingml/2006/main" noChangeAspect="1"/>
+            </wp:cNvGraphicFramePr>
+            <a:graphic xmlns:a="http://schemas.openxmlformats.org/drawingml/2006/main">
+              <a:graphicData uri="http://schemas.openxmlformats.org/drawingml/2006/picture">
+                <pic:pic xmlns:pic="http://schemas.openxmlformats.org/drawingml/2006/picture">
+                  <pic:nvPicPr>
+                    <pic:cNvPr id="1645218508" name=""/>
+                    <pic:cNvPicPr/>
+                  </pic:nvPicPr>
+                  <pic:blipFill>
+                    <a:blip r:embed="rId33"/>
+                    <a:stretch>
+                      <a:fillRect/>
+                    </a:stretch>
+                  </pic:blipFill>
+                  <pic:spPr>
+                    <a:xfrm>
+                      <a:off x="0" y="0"/>
+                      <a:ext cx="2819794" cy="552527"/>
+                    </a:xfrm>
+                    <a:prstGeom prst="rect">
+                      <a:avLst/>
+                    </a:prstGeom>
+                  </pic:spPr>
+                </pic:pic>
+              </a:graphicData>
+            </a:graphic>
+          </wp:inline>
+        </w:drawing>
+      </w:r>
+    </w:p>
+    <w:p>
+      <w:pPr>
+        <w:rPr>
+          <w:b/>
+          <w:bCs/>
+          <w:sz w:val="36"/>
+          <w:szCs w:val="36"/>
+          <w:lang w:val="es-MX"/>
+        </w:rPr>
+      </w:pPr>
+      <w:r>
+        <w:rPr>
+          <w:b/>
+          <w:bCs/>
+          <w:sz w:val="36"/>
+          <w:szCs w:val="36"/>
+          <w:lang w:val="es-MX"/>
+        </w:rPr>
+        <w:t>EP</w:t>
+      </w:r>
+      <w:r>
+        <w:rPr>
+          <w:b/>
+          <w:bCs/>
+          <w:sz w:val="36"/>
+          <w:szCs w:val="36"/>
+          <w:lang w:val="es-MX"/>
+        </w:rPr>
+        <w:t>6</w:t>
+      </w:r>
+    </w:p>
+    <w:p>
+      <w:pPr>
+        <w:rPr>
+          <w:b/>
+          <w:bCs/>
+          <w:sz w:val="36"/>
+          <w:szCs w:val="36"/>
+          <w:lang w:val="es-MX"/>
+        </w:rPr>
+      </w:pPr>
+      <w:r>
+        <w:rPr>
+          <w:b/>
+          <w:bCs/>
+          <w:sz w:val="36"/>
+          <w:szCs w:val="36"/>
+          <w:lang w:val="es-MX"/>
+        </w:rPr>
+        <w:drawing>
+          <wp:inline distT="0" distB="0" distL="0" distR="0" wp14:anchorId="015819EE" wp14:editId="2BE777BC">
+            <wp:extent cx="3810532" cy="3162741"/>
+            <wp:effectExtent l="0" t="0" r="0" b="0"/>
+            <wp:docPr id="1283275490" name="Imagen 1"/>
+            <wp:cNvGraphicFramePr>
+              <a:graphicFrameLocks xmlns:a="http://schemas.openxmlformats.org/drawingml/2006/main" noChangeAspect="1"/>
+            </wp:cNvGraphicFramePr>
+            <a:graphic xmlns:a="http://schemas.openxmlformats.org/drawingml/2006/main">
+              <a:graphicData uri="http://schemas.openxmlformats.org/drawingml/2006/picture">
+                <pic:pic xmlns:pic="http://schemas.openxmlformats.org/drawingml/2006/picture">
+                  <pic:nvPicPr>
+                    <pic:cNvPr id="1283275490" name=""/>
+                    <pic:cNvPicPr/>
+                  </pic:nvPicPr>
+                  <pic:blipFill>
+                    <a:blip r:embed="rId34"/>
+                    <a:stretch>
+                      <a:fillRect/>
+                    </a:stretch>
+                  </pic:blipFill>
+                  <pic:spPr>
+                    <a:xfrm>
+                      <a:off x="0" y="0"/>
+                      <a:ext cx="3810532" cy="3162741"/>
+                    </a:xfrm>
+                    <a:prstGeom prst="rect">
+                      <a:avLst/>
+                    </a:prstGeom>
+                  </pic:spPr>
+                </pic:pic>
+              </a:graphicData>
+            </a:graphic>
+          </wp:inline>
+        </w:drawing>
+      </w:r>
+    </w:p>
+    <w:p>
+      <w:pPr>
+        <w:rPr>
+          <w:b/>
+          <w:bCs/>
+          <w:sz w:val="36"/>
+          <w:szCs w:val="36"/>
+          <w:lang w:val="es-MX"/>
+        </w:rPr>
+      </w:pPr>
+      <w:r>
+        <w:rPr>
+          <w:b/>
+          <w:bCs/>
+          <w:sz w:val="36"/>
+          <w:szCs w:val="36"/>
+          <w:lang w:val="es-MX"/>
+        </w:rPr>
+        <w:drawing>
+          <wp:inline distT="0" distB="0" distL="0" distR="0" wp14:anchorId="0B4B8C1D" wp14:editId="6C4ADECB">
+            <wp:extent cx="2000529" cy="504895"/>
+            <wp:effectExtent l="0" t="0" r="0" b="9525"/>
+            <wp:docPr id="882710857" name="Imagen 1"/>
+            <wp:cNvGraphicFramePr>
+              <a:graphicFrameLocks xmlns:a="http://schemas.openxmlformats.org/drawingml/2006/main" noChangeAspect="1"/>
+            </wp:cNvGraphicFramePr>
+            <a:graphic xmlns:a="http://schemas.openxmlformats.org/drawingml/2006/main">
+              <a:graphicData uri="http://schemas.openxmlformats.org/drawingml/2006/picture">
+                <pic:pic xmlns:pic="http://schemas.openxmlformats.org/drawingml/2006/picture">
+                  <pic:nvPicPr>
+                    <pic:cNvPr id="882710857" name=""/>
+                    <pic:cNvPicPr/>
+                  </pic:nvPicPr>
+                  <pic:blipFill>
+                    <a:blip r:embed="rId35"/>
+                    <a:stretch>
+                      <a:fillRect/>
+                    </a:stretch>
+                  </pic:blipFill>
+                  <pic:spPr>
+                    <a:xfrm>
+                      <a:off x="0" y="0"/>
+                      <a:ext cx="2000529" cy="504895"/>
+                    </a:xfrm>
+                    <a:prstGeom prst="rect">
+                      <a:avLst/>
+                    </a:prstGeom>
+                  </pic:spPr>
+                </pic:pic>
+              </a:graphicData>
+            </a:graphic>
+          </wp:inline>
+        </w:drawing>
+      </w:r>
+    </w:p>
+    <w:p>
+      <w:pPr>
+        <w:rPr>
+          <w:b/>
+          <w:bCs/>
+          <w:sz w:val="36"/>
+          <w:szCs w:val="36"/>
+          <w:lang w:val="es-MX"/>
+        </w:rPr>
+      </w:pPr>
+    </w:p>
+    <w:p>
+      <w:pPr>
+        <w:rPr>
+          <w:b/>
+          <w:bCs/>
+          <w:sz w:val="36"/>
+          <w:szCs w:val="36"/>
+          <w:lang w:val="es-MX"/>
+        </w:rPr>
+      </w:pPr>
+      <w:r>
+        <w:rPr>
+          <w:b/>
+          <w:bCs/>
+          <w:sz w:val="36"/>
+          <w:szCs w:val="36"/>
+          <w:lang w:val="es-MX"/>
+        </w:rPr>
+        <w:lastRenderedPageBreak/>
+        <w:t>EP</w:t>
+      </w:r>
+      <w:r>
+        <w:rPr>
+          <w:b/>
+          <w:bCs/>
+          <w:sz w:val="36"/>
+          <w:szCs w:val="36"/>
+          <w:lang w:val="es-MX"/>
+        </w:rPr>
+        <w:t>7</w:t>
+      </w:r>
+    </w:p>
+    <w:p>
+      <w:pPr>
+        <w:rPr>
+          <w:b/>
+          <w:bCs/>
+          <w:sz w:val="36"/>
+          <w:szCs w:val="36"/>
+          <w:lang w:val="es-MX"/>
+        </w:rPr>
+      </w:pPr>
+      <w:r>
+        <w:rPr>
+          <w:b/>
+          <w:bCs/>
+          <w:sz w:val="36"/>
+          <w:szCs w:val="36"/>
+          <w:lang w:val="es-MX"/>
+        </w:rPr>
+        <w:drawing>
+          <wp:inline distT="0" distB="0" distL="0" distR="0" wp14:anchorId="5140817E" wp14:editId="1475444F">
+            <wp:extent cx="4496832" cy="2724150"/>
+            <wp:effectExtent l="0" t="0" r="0" b="0"/>
+            <wp:docPr id="1017514982" name="Imagen 1"/>
+            <wp:cNvGraphicFramePr>
+              <a:graphicFrameLocks xmlns:a="http://schemas.openxmlformats.org/drawingml/2006/main" noChangeAspect="1"/>
+            </wp:cNvGraphicFramePr>
+            <a:graphic xmlns:a="http://schemas.openxmlformats.org/drawingml/2006/main">
+              <a:graphicData uri="http://schemas.openxmlformats.org/drawingml/2006/picture">
+                <pic:pic xmlns:pic="http://schemas.openxmlformats.org/drawingml/2006/picture">
+                  <pic:nvPicPr>
+                    <pic:cNvPr id="1017514982" name=""/>
+                    <pic:cNvPicPr/>
+                  </pic:nvPicPr>
+                  <pic:blipFill>
+                    <a:blip r:embed="rId36"/>
+                    <a:stretch>
+                      <a:fillRect/>
+                    </a:stretch>
+                  </pic:blipFill>
+                  <pic:spPr>
+                    <a:xfrm>
+                      <a:off x="0" y="0"/>
+                      <a:ext cx="4500433" cy="2726332"/>
+                    </a:xfrm>
+                    <a:prstGeom prst="rect">
+                      <a:avLst/>
+                    </a:prstGeom>
+                  </pic:spPr>
+                </pic:pic>
+              </a:graphicData>
+            </a:graphic>
+          </wp:inline>
+        </w:drawing>
+      </w:r>
+      <w:r>
+        <w:rPr>
+          <w:b/>
+          <w:bCs/>
+          <w:sz w:val="36"/>
+          <w:szCs w:val="36"/>
+          <w:lang w:val="es-MX"/>
+        </w:rPr>
+        <w:drawing>
+          <wp:inline distT="0" distB="0" distL="0" distR="0" wp14:anchorId="3E60F20F" wp14:editId="2832F56E">
+            <wp:extent cx="2124371" cy="342948"/>
+            <wp:effectExtent l="0" t="0" r="0" b="0"/>
+            <wp:docPr id="1092092560" name="Imagen 1"/>
+            <wp:cNvGraphicFramePr>
+              <a:graphicFrameLocks xmlns:a="http://schemas.openxmlformats.org/drawingml/2006/main" noChangeAspect="1"/>
+            </wp:cNvGraphicFramePr>
+            <a:graphic xmlns:a="http://schemas.openxmlformats.org/drawingml/2006/main">
+              <a:graphicData uri="http://schemas.openxmlformats.org/drawingml/2006/picture">
+                <pic:pic xmlns:pic="http://schemas.openxmlformats.org/drawingml/2006/picture">
+                  <pic:nvPicPr>
+                    <pic:cNvPr id="1092092560" name=""/>
+                    <pic:cNvPicPr/>
+                  </pic:nvPicPr>
+                  <pic:blipFill>
+                    <a:blip r:embed="rId37"/>
+                    <a:stretch>
+                      <a:fillRect/>
+                    </a:stretch>
+                  </pic:blipFill>
+                  <pic:spPr>
+                    <a:xfrm>
+                      <a:off x="0" y="0"/>
+                      <a:ext cx="2124371" cy="342948"/>
+                    </a:xfrm>
+                    <a:prstGeom prst="rect">
+                      <a:avLst/>
+                    </a:prstGeom>
+                  </pic:spPr>
+                </pic:pic>
+              </a:graphicData>
+            </a:graphic>
+          </wp:inline>
+        </w:drawing>
+      </w:r>
+    </w:p>
+    <w:p>
+      <w:pPr>
+        <w:rPr>
+          <w:b/>
+          <w:bCs/>
+          <w:sz w:val="36"/>
+          <w:szCs w:val="36"/>
+          <w:lang w:val="es-MX"/>
+        </w:rPr>
+      </w:pPr>
+      <w:r>
+        <w:rPr>
+          <w:b/>
+          <w:bCs/>
+          <w:sz w:val="36"/>
+          <w:szCs w:val="36"/>
+          <w:lang w:val="es-MX"/>
+        </w:rPr>
+        <w:t>EP</w:t>
+      </w:r>
+      <w:r>
+        <w:rPr>
+          <w:b/>
+          <w:bCs/>
+          <w:sz w:val="36"/>
+          <w:szCs w:val="36"/>
+          <w:lang w:val="es-MX"/>
+        </w:rPr>
+        <w:t>8</w:t>
+      </w:r>
+    </w:p>
+    <w:p>
+      <w:pPr>
+        <w:rPr>
+          <w:b/>
+          <w:bCs/>
+          <w:sz w:val="36"/>
+          <w:szCs w:val="36"/>
+          <w:lang w:val="es-MX"/>
+        </w:rPr>
+      </w:pPr>
+      <w:r>
+        <w:rPr>
+          <w:b/>
+          <w:bCs/>
+          <w:sz w:val="36"/>
+          <w:szCs w:val="36"/>
+          <w:lang w:val="es-MX"/>
+        </w:rPr>
+        <w:drawing>
+          <wp:inline distT="0" distB="0" distL="0" distR="0" wp14:anchorId="5FBBED76" wp14:editId="4791AA66">
+            <wp:extent cx="2553056" cy="495369"/>
+            <wp:effectExtent l="0" t="0" r="0" b="0"/>
+            <wp:docPr id="1315223314" name="Imagen 1"/>
+            <wp:cNvGraphicFramePr>
+              <a:graphicFrameLocks xmlns:a="http://schemas.openxmlformats.org/drawingml/2006/main" noChangeAspect="1"/>
+            </wp:cNvGraphicFramePr>
+            <a:graphic xmlns:a="http://schemas.openxmlformats.org/drawingml/2006/main">
+              <a:graphicData uri="http://schemas.openxmlformats.org/drawingml/2006/picture">
+                <pic:pic xmlns:pic="http://schemas.openxmlformats.org/drawingml/2006/picture">
+                  <pic:nvPicPr>
+                    <pic:cNvPr id="1315223314" name=""/>
+                    <pic:cNvPicPr/>
+                  </pic:nvPicPr>
+                  <pic:blipFill>
+                    <a:blip r:embed="rId38"/>
+                    <a:stretch>
+                      <a:fillRect/>
+                    </a:stretch>
+                  </pic:blipFill>
+                  <pic:spPr>
+                    <a:xfrm>
+                      <a:off x="0" y="0"/>
+                      <a:ext cx="2553056" cy="495369"/>
+                    </a:xfrm>
+                    <a:prstGeom prst="rect">
+                      <a:avLst/>
+                    </a:prstGeom>
+                  </pic:spPr>
+                </pic:pic>
+              </a:graphicData>
+            </a:graphic>
+          </wp:inline>
+        </w:drawing>
+      </w:r>
+      <w:r>
+        <w:rPr>
+          <w:b/>
+          <w:bCs/>
+          <w:sz w:val="36"/>
+          <w:szCs w:val="36"/>
+          <w:lang w:val="es-MX"/>
+        </w:rPr>
+        <w:drawing>
+          <wp:inline distT="0" distB="0" distL="0" distR="0" wp14:anchorId="75B00B01" wp14:editId="53DF55D9">
+            <wp:extent cx="4194004" cy="3238500"/>
+            <wp:effectExtent l="0" t="0" r="0" b="0"/>
+            <wp:docPr id="1082799862" name="Imagen 1"/>
+            <wp:cNvGraphicFramePr>
+              <a:graphicFrameLocks xmlns:a="http://schemas.openxmlformats.org/drawingml/2006/main" noChangeAspect="1"/>
+            </wp:cNvGraphicFramePr>
+            <a:graphic xmlns:a="http://schemas.openxmlformats.org/drawingml/2006/main">
+              <a:graphicData uri="http://schemas.openxmlformats.org/drawingml/2006/picture">
+                <pic:pic xmlns:pic="http://schemas.openxmlformats.org/drawingml/2006/picture">
+                  <pic:nvPicPr>
+                    <pic:cNvPr id="1082799862" name=""/>
+                    <pic:cNvPicPr/>
+                  </pic:nvPicPr>
+                  <pic:blipFill>
+                    <a:blip r:embed="rId39"/>
+                    <a:stretch>
+                      <a:fillRect/>
+                    </a:stretch>
+                  </pic:blipFill>
+                  <pic:spPr>
+                    <a:xfrm>
+                      <a:off x="0" y="0"/>
+                      <a:ext cx="4215771" cy="3255308"/>
+                    </a:xfrm>
+                    <a:prstGeom prst="rect">
+                      <a:avLst/>
+                    </a:prstGeom>
+                  </pic:spPr>
+                </pic:pic>
+              </a:graphicData>
+            </a:graphic>
+          </wp:inline>
+        </w:drawing>
+      </w:r>
+    </w:p>
+    <w:p>
+      <w:pPr>
+        <w:rPr>
+          <w:b/>
+          <w:bCs/>
+          <w:sz w:val="36"/>
+          <w:szCs w:val="36"/>
+          <w:lang w:val="es-MX"/>
+        </w:rPr>
+      </w:pPr>
+      <w:r>
+        <w:rPr>
+          <w:b/>
+          <w:bCs/>
+          <w:sz w:val="36"/>
+          <w:szCs w:val="36"/>
+          <w:lang w:val="es-MX"/>
+        </w:rPr>
+        <w:lastRenderedPageBreak/>
+        <w:t>EP</w:t>
+      </w:r>
+      <w:r>
+        <w:rPr>
+          <w:b/>
+          <w:bCs/>
+          <w:sz w:val="36"/>
+          <w:szCs w:val="36"/>
+          <w:lang w:val="es-MX"/>
+        </w:rPr>
+        <w:t>9</w:t>
+      </w:r>
+    </w:p>
+    <w:p>
+      <w:pPr>
+        <w:rPr>
+          <w:b/>
+          <w:bCs/>
+          <w:sz w:val="36"/>
+          <w:szCs w:val="36"/>
+          <w:lang w:val="es-MX"/>
+        </w:rPr>
+      </w:pPr>
+      <w:r>
+        <w:rPr>
+          <w:b/>
+          <w:bCs/>
+          <w:sz w:val="36"/>
+          <w:szCs w:val="36"/>
+          <w:lang w:val="es-MX"/>
+        </w:rPr>
+        <w:drawing>
+          <wp:inline distT="0" distB="0" distL="0" distR="0" wp14:anchorId="24C82894" wp14:editId="2DC96A5E">
+            <wp:extent cx="4172532" cy="2591162"/>
+            <wp:effectExtent l="0" t="0" r="0" b="0"/>
+            <wp:docPr id="1044059588" name="Imagen 1"/>
+            <wp:cNvGraphicFramePr>
+              <a:graphicFrameLocks xmlns:a="http://schemas.openxmlformats.org/drawingml/2006/main" noChangeAspect="1"/>
+            </wp:cNvGraphicFramePr>
+            <a:graphic xmlns:a="http://schemas.openxmlformats.org/drawingml/2006/main">
+              <a:graphicData uri="http://schemas.openxmlformats.org/drawingml/2006/picture">
+                <pic:pic xmlns:pic="http://schemas.openxmlformats.org/drawingml/2006/picture">
+                  <pic:nvPicPr>
+                    <pic:cNvPr id="1044059588" name=""/>
+                    <pic:cNvPicPr/>
+                  </pic:nvPicPr>
+                  <pic:blipFill>
+                    <a:blip r:embed="rId40"/>
+                    <a:stretch>
+                      <a:fillRect/>
+                    </a:stretch>
+                  </pic:blipFill>
+                  <pic:spPr>
+                    <a:xfrm>
+                      <a:off x="0" y="0"/>
+                      <a:ext cx="4172532" cy="2591162"/>
+                    </a:xfrm>
+                    <a:prstGeom prst="rect">
+                      <a:avLst/>
+                    </a:prstGeom>
+                  </pic:spPr>
+                </pic:pic>
+              </a:graphicData>
+            </a:graphic>
+          </wp:inline>
+        </w:drawing>
+      </w:r>
+      <w:r>
+        <w:rPr>
+          <w:b/>
+          <w:bCs/>
+          <w:sz w:val="36"/>
+          <w:szCs w:val="36"/>
+          <w:lang w:val="es-MX"/>
+        </w:rPr>
+        <w:drawing>
+          <wp:inline distT="0" distB="0" distL="0" distR="0" wp14:anchorId="7EC40C2B" wp14:editId="4213C761">
+            <wp:extent cx="2248214" cy="342948"/>
+            <wp:effectExtent l="0" t="0" r="0" b="0"/>
+            <wp:docPr id="1308974716" name="Imagen 1"/>
+            <wp:cNvGraphicFramePr>
+              <a:graphicFrameLocks xmlns:a="http://schemas.openxmlformats.org/drawingml/2006/main" noChangeAspect="1"/>
+            </wp:cNvGraphicFramePr>
+            <a:graphic xmlns:a="http://schemas.openxmlformats.org/drawingml/2006/main">
+              <a:graphicData uri="http://schemas.openxmlformats.org/drawingml/2006/picture">
+                <pic:pic xmlns:pic="http://schemas.openxmlformats.org/drawingml/2006/picture">
+                  <pic:nvPicPr>
+                    <pic:cNvPr id="1308974716" name=""/>
+                    <pic:cNvPicPr/>
+                  </pic:nvPicPr>
+                  <pic:blipFill>
+                    <a:blip r:embed="rId41"/>
+                    <a:stretch>
+                      <a:fillRect/>
+                    </a:stretch>
+                  </pic:blipFill>
+                  <pic:spPr>
+                    <a:xfrm>
+                      <a:off x="0" y="0"/>
+                      <a:ext cx="2248214" cy="342948"/>
+                    </a:xfrm>
+                    <a:prstGeom prst="rect">
+                      <a:avLst/>
+                    </a:prstGeom>
+                  </pic:spPr>
+                </pic:pic>
+              </a:graphicData>
+            </a:graphic>
+          </wp:inline>
+        </w:drawing>
+      </w:r>
+    </w:p>
+    <w:p>
+      <w:pPr>
+        <w:rPr>
+          <w:b/>
+          <w:bCs/>
+          <w:sz w:val="36"/>
+          <w:szCs w:val="36"/>
+          <w:lang w:val="es-MX"/>
+        </w:rPr>
+      </w:pPr>
+      <w:r>
+        <w:rPr>
+          <w:b/>
+          <w:bCs/>
+          <w:sz w:val="36"/>
+          <w:szCs w:val="36"/>
+          <w:lang w:val="es-MX"/>
+        </w:rPr>
+        <w:t>EP</w:t>
+      </w:r>
+      <w:r>
+        <w:rPr>
+          <w:b/>
+          <w:bCs/>
+          <w:sz w:val="36"/>
+          <w:szCs w:val="36"/>
+          <w:lang w:val="es-MX"/>
+        </w:rPr>
+        <w:t>10</w:t>
+      </w:r>
+    </w:p>
+    <w:p>
+      <w:pPr>
+        <w:rPr>
+          <w:b/>
+          <w:bCs/>
+          <w:sz w:val="36"/>
+          <w:szCs w:val="36"/>
+          <w:lang w:val="es-MX"/>
+        </w:rPr>
+      </w:pPr>
+      <w:r>
+        <w:rPr>
+          <w:b/>
+          <w:bCs/>
+          <w:sz w:val="36"/>
+          <w:szCs w:val="36"/>
+          <w:lang w:val="es-MX"/>
+        </w:rPr>
+        <w:drawing>
+          <wp:inline distT="0" distB="0" distL="0" distR="0" wp14:anchorId="349452EB" wp14:editId="2F61CF77">
+            <wp:extent cx="6506493" cy="3695700"/>
+            <wp:effectExtent l="0" t="0" r="8890" b="0"/>
+            <wp:docPr id="1391923248" name="Imagen 1"/>
+            <wp:cNvGraphicFramePr>
+              <a:graphicFrameLocks xmlns:a="http://schemas.openxmlformats.org/drawingml/2006/main" noChangeAspect="1"/>
+            </wp:cNvGraphicFramePr>
+            <a:graphic xmlns:a="http://schemas.openxmlformats.org/drawingml/2006/main">
+              <a:graphicData uri="http://schemas.openxmlformats.org/drawingml/2006/picture">
+                <pic:pic xmlns:pic="http://schemas.openxmlformats.org/drawingml/2006/picture">
+                  <pic:nvPicPr>
+                    <pic:cNvPr id="1391923248" name=""/>
+                    <pic:cNvPicPr/>
+                  </pic:nvPicPr>
+                  <pic:blipFill>
+                    <a:blip r:embed="rId42"/>
+                    <a:stretch>
+                      <a:fillRect/>
+                    </a:stretch>
+                  </pic:blipFill>
+                  <pic:spPr>
+                    <a:xfrm>
+                      <a:off x="0" y="0"/>
+                      <a:ext cx="6511564" cy="3698580"/>
+                    </a:xfrm>
+                    <a:prstGeom prst="rect">
+                      <a:avLst/>
+                    </a:prstGeom>
+                  </pic:spPr>
+                </pic:pic>
+              </a:graphicData>
+            </a:graphic>
+          </wp:inline>
+        </w:drawing>
+      </w:r>
+    </w:p>
+    <w:p>
+      <w:pPr>
+        <w:rPr>
+          <w:b/>
+          <w:bCs/>
+          <w:sz w:val="36"/>
+          <w:szCs w:val="36"/>
+          <w:lang w:val="es-MX"/>
+        </w:rPr>
+      </w:pPr>
+      <w:r>
+        <w:rPr>
+          <w:b/>
+          <w:bCs/>
+          <w:sz w:val="36"/>
+          <w:szCs w:val="36"/>
+          <w:lang w:val="es-MX"/>
+        </w:rPr>
+        <w:br w:type="page"/>
+      </w:r>
+    </w:p>
+    <w:p>
+      <w:pPr>
+        <w:rPr>
+          <w:b/>
+          <w:bCs/>
+          <w:sz w:val="36"/>
+          <w:szCs w:val="36"/>
+          <w:lang w:val="es-MX"/>
+        </w:rPr>
+      </w:pPr>
+      <w:r>
+        <w:rPr>
+          <w:b/>
+          <w:bCs/>
+          <w:sz w:val="36"/>
+          <w:szCs w:val="36"/>
+          <w:lang w:val="es-MX"/>
+        </w:rPr>
+        <w:lastRenderedPageBreak/>
+        <w:drawing>
+          <wp:inline distT="0" distB="0" distL="0" distR="0" wp14:anchorId="7981F837" wp14:editId="0A1C3C69">
+            <wp:extent cx="4515480" cy="2524477"/>
+            <wp:effectExtent l="0" t="0" r="0" b="9525"/>
+            <wp:docPr id="665828600" name="Imagen 1"/>
+            <wp:cNvGraphicFramePr>
+              <a:graphicFrameLocks xmlns:a="http://schemas.openxmlformats.org/drawingml/2006/main" noChangeAspect="1"/>
+            </wp:cNvGraphicFramePr>
+            <a:graphic xmlns:a="http://schemas.openxmlformats.org/drawingml/2006/main">
+              <a:graphicData uri="http://schemas.openxmlformats.org/drawingml/2006/picture">
+                <pic:pic xmlns:pic="http://schemas.openxmlformats.org/drawingml/2006/picture">
+                  <pic:nvPicPr>
+                    <pic:cNvPr id="665828600" name=""/>
+                    <pic:cNvPicPr/>
+                  </pic:nvPicPr>
+                  <pic:blipFill>
+                    <a:blip r:embed="rId43"/>
+                    <a:stretch>
+                      <a:fillRect/>
+                    </a:stretch>
+                  </pic:blipFill>
+                  <pic:spPr>
+                    <a:xfrm>
+                      <a:off x="0" y="0"/>
+                      <a:ext cx="4515480" cy="2524477"/>
+                    </a:xfrm>
+                    <a:prstGeom prst="rect">
+                      <a:avLst/>
+                    </a:prstGeom>
+                  </pic:spPr>
+                </pic:pic>
+              </a:graphicData>
+            </a:graphic>
+          </wp:inline>
+        </w:drawing>
+      </w:r>
+    </w:p>
+    <w:p>
+      <w:pPr>
+        <w:rPr>
+          <w:rFonts w:ascii="Arial Black" w:hAnsi="Arial Black"/>
+          <w:b/>
+          <w:bCs/>
+          <w:sz w:val="36"/>
+          <w:szCs w:val="36"/>
+          <w:lang w:val="es-MX"/>
+        </w:rPr>
+      </w:pPr>
+    </w:p>
+    <w:p>
+      <w:pPr>
+        <w:rPr>
+          <w:b/>
+          <w:bCs/>
+          <w:sz w:val="36"/>
+          <w:szCs w:val="36"/>
+          <w:lang w:val="es-MX"/>
+        </w:rPr>
+      </w:pPr>
     </w:p>
     <w:sectPr>
       <w:pgSz w:w="12240" w:h="15840"/>
@@ -1631,7 +3584,7 @@
   <w:style w:type="paragraph" w:default="1" w:styleId="Normal">
     <w:name w:val="Normal"/>
     <w:qFormat/>
-    <w:rsid w:val="00623698"/>
+    <w:rsid w:val="00EA1A64"/>
   </w:style>
   <w:style w:type="paragraph" w:styleId="Ttulo1">
     <w:name w:val="heading 1"/>

</xml_diff>